<commit_message>
Update on 04 Apr 2025 at 10:15
</commit_message>
<xml_diff>
--- a/00_index.docx
+++ b/00_index.docx
@@ -7,7 +7,15 @@
         <w:pStyle w:val="Heading1"/>
       </w:pPr>
       <w:r>
-        <w:t>For a new hermeneutics of practice in digital public history: thinkering with memorecord.uni.lu</w:t>
+        <w:t xml:space="preserve">For a new hermeneutics of practice in digital public history: </w:t>
+      </w:r>
+      <w:proofErr w:type="spellStart"/>
+      <w:r>
+        <w:t>thinkering</w:t>
+      </w:r>
+      <w:proofErr w:type="spellEnd"/>
+      <w:r>
+        <w:t xml:space="preserve"> with memorecord.uni.lu</w:t>
       </w:r>
     </w:p>
     <w:p/>
@@ -29,49 +37,500 @@
         </w:tabs>
         <w:spacing w:line="240" w:lineRule="auto"/>
         <w:rPr>
-          <w:rFonts w:ascii="Cambria" w:hAnsi="Cambria" w:eastAsia="Cambria" w:cs="" w:asciiTheme="minorAscii" w:hAnsiTheme="minorAscii" w:eastAsiaTheme="minorAscii" w:cstheme="minorBidi"/>
-          <w:sz w:val="24"/>
-          <w:szCs w:val="24"/>
-          <w:lang w:val="en-GB"/>
-        </w:rPr>
-      </w:pPr>
-      <w:r>
-        <w:rPr>
-          <w:rFonts w:ascii="Cambria" w:hAnsi="Cambria" w:eastAsia="Cambria" w:cs="" w:asciiTheme="minorAscii" w:hAnsiTheme="minorAscii" w:eastAsiaTheme="minorAscii" w:cstheme="minorBidi"/>
-          <w:sz w:val="24"/>
-          <w:szCs w:val="24"/>
-          <w:lang w:val="en-GB"/>
+          <w:rFonts w:asciiTheme="minorHAnsi" w:eastAsiaTheme="minorHAnsi" w:hAnsiTheme="minorHAnsi" w:cstheme="minorBidi"/>
+          <w:sz w:val="24"/>
+          <w:szCs w:val="24"/>
+          <w:lang w:val="en-US"/>
+        </w:rPr>
+      </w:pPr>
+      <w:r>
+        <w:rPr>
+          <w:rFonts w:asciiTheme="minorHAnsi" w:eastAsiaTheme="minorHAnsi" w:hAnsiTheme="minorHAnsi" w:cstheme="minorBidi"/>
+          <w:sz w:val="24"/>
+          <w:szCs w:val="24"/>
+          <w:lang w:val="en-US"/>
+        </w:rPr>
+        <w:t>::::{grid}</w:t>
+      </w:r>
+      <w:r>
+        <w:rPr>
+          <w:rFonts w:asciiTheme="minorHAnsi" w:eastAsiaTheme="minorHAnsi" w:hAnsiTheme="minorHAnsi" w:cstheme="minorBidi"/>
+          <w:sz w:val="24"/>
+          <w:szCs w:val="24"/>
+          <w:lang w:val="en-US"/>
+        </w:rPr>
+        <w:br/>
+      </w:r>
+      <w:r>
+        <w:rPr>
+          <w:rFonts w:asciiTheme="minorHAnsi" w:eastAsiaTheme="minorHAnsi" w:hAnsiTheme="minorHAnsi" w:cstheme="minorBidi"/>
+          <w:sz w:val="24"/>
+          <w:szCs w:val="24"/>
+          <w:lang w:val="en-US"/>
+        </w:rPr>
+        <w:t>:gutter: 3</w:t>
+      </w:r>
+      <w:r>
+        <w:rPr>
+          <w:rFonts w:asciiTheme="minorHAnsi" w:eastAsiaTheme="minorHAnsi" w:hAnsiTheme="minorHAnsi" w:cstheme="minorBidi"/>
+          <w:sz w:val="24"/>
+          <w:szCs w:val="24"/>
+          <w:lang w:val="en-US"/>
+        </w:rPr>
+        <w:br/>
+      </w:r>
+      <w:r>
+        <w:rPr>
+          <w:rFonts w:asciiTheme="minorHAnsi" w:eastAsiaTheme="minorHAnsi" w:hAnsiTheme="minorHAnsi" w:cstheme="minorBidi"/>
+          <w:sz w:val="24"/>
+          <w:szCs w:val="24"/>
+          <w:lang w:val="en-US"/>
+        </w:rPr>
+        <w:t>:::{grid-item-card} Chapter 1</w:t>
+      </w:r>
+      <w:r>
+        <w:rPr>
+          <w:rFonts w:asciiTheme="minorHAnsi" w:eastAsiaTheme="minorHAnsi" w:hAnsiTheme="minorHAnsi" w:cstheme="minorBidi"/>
+          <w:sz w:val="24"/>
+          <w:szCs w:val="24"/>
+          <w:lang w:val="en-US"/>
+        </w:rPr>
+        <w:br/>
+      </w:r>
+      <w:r>
+        <w:rPr>
+          <w:rFonts w:asciiTheme="minorHAnsi" w:eastAsiaTheme="minorHAnsi" w:hAnsiTheme="minorHAnsi" w:cstheme="minorBidi"/>
+          <w:sz w:val="24"/>
+          <w:szCs w:val="24"/>
+          <w:lang w:val="en-US"/>
+        </w:rPr>
+        <w:t xml:space="preserve">:link: </w:t>
+      </w:r>
+      <w:r>
+        <w:rPr>
+          <w:rFonts w:asciiTheme="minorHAnsi" w:eastAsiaTheme="minorHAnsi" w:hAnsiTheme="minorHAnsi" w:cstheme="minorBidi"/>
+          <w:sz w:val="24"/>
+          <w:szCs w:val="24"/>
+          <w:lang w:val="en-US"/>
+        </w:rPr>
+        <w:t>04_</w:t>
+      </w:r>
+      <w:r>
+        <w:rPr>
+          <w:rFonts w:asciiTheme="minorHAnsi" w:eastAsiaTheme="minorHAnsi" w:hAnsiTheme="minorHAnsi" w:cstheme="minorBidi"/>
+          <w:sz w:val="24"/>
+          <w:szCs w:val="24"/>
+        </w:rPr>
+        <w:t>chapter-1-epistemic-virtues-and-the-foundations-of-historical-practice</w:t>
+      </w:r>
+      <w:r>
+        <w:rPr>
+          <w:rFonts w:asciiTheme="minorHAnsi" w:eastAsiaTheme="minorHAnsi" w:hAnsiTheme="minorHAnsi" w:cstheme="minorBidi"/>
+          <w:sz w:val="24"/>
+          <w:szCs w:val="24"/>
+          <w:lang w:val="en-US"/>
+        </w:rPr>
+        <w:t>.html</w:t>
+      </w:r>
+      <w:r>
+        <w:rPr>
+          <w:rFonts w:asciiTheme="minorHAnsi" w:eastAsiaTheme="minorHAnsi" w:hAnsiTheme="minorHAnsi" w:cstheme="minorBidi"/>
+          <w:sz w:val="24"/>
+          <w:szCs w:val="24"/>
+          <w:lang w:val="en-US"/>
+        </w:rPr>
+        <w:br/>
+      </w:r>
+      <w:r>
+        <w:rPr>
+          <w:rFonts w:asciiTheme="minorHAnsi" w:eastAsiaTheme="minorHAnsi" w:hAnsiTheme="minorHAnsi" w:cstheme="minorBidi"/>
+          <w:sz w:val="24"/>
+          <w:szCs w:val="24"/>
+          <w:lang w:val="en-US"/>
+        </w:rPr>
+        <w:t>Chapter 1: Epistemic Virtues and the Foundations of Historical Practice</w:t>
+      </w:r>
+      <w:r>
+        <w:rPr>
+          <w:rFonts w:asciiTheme="minorHAnsi" w:eastAsiaTheme="minorHAnsi" w:hAnsiTheme="minorHAnsi" w:cstheme="minorBidi"/>
+          <w:sz w:val="24"/>
+          <w:szCs w:val="24"/>
+          <w:lang w:val="en-US"/>
+        </w:rPr>
+        <w:br/>
+      </w:r>
+      <w:r>
+        <w:rPr>
+          <w:rFonts w:asciiTheme="minorHAnsi" w:eastAsiaTheme="minorHAnsi" w:hAnsiTheme="minorHAnsi" w:cstheme="minorBidi"/>
+          <w:sz w:val="24"/>
+          <w:szCs w:val="24"/>
+          <w:lang w:val="en-US"/>
         </w:rPr>
         <w:t>:::</w:t>
       </w:r>
       <w:r>
         <w:rPr>
-          <w:rFonts w:ascii="Cambria" w:hAnsi="Cambria" w:eastAsia="Cambria" w:cs="" w:asciiTheme="minorAscii" w:hAnsiTheme="minorAscii" w:eastAsiaTheme="minorAscii" w:cstheme="minorBidi"/>
-          <w:sz w:val="24"/>
-          <w:szCs w:val="24"/>
-          <w:lang w:val="en-GB"/>
-        </w:rPr>
-        <w:t>{</w:t>
-      </w:r>
-      <w:r>
-        <w:rPr>
-          <w:rFonts w:ascii="Cambria" w:hAnsi="Cambria" w:eastAsia="Cambria" w:cs="" w:asciiTheme="minorAscii" w:hAnsiTheme="minorAscii" w:eastAsiaTheme="minorAscii" w:cstheme="minorBidi"/>
-          <w:sz w:val="24"/>
-          <w:szCs w:val="24"/>
-          <w:lang w:val="en-GB"/>
-        </w:rPr>
-        <w:t>note</w:t>
-      </w:r>
-      <w:r>
-        <w:rPr>
-          <w:rFonts w:ascii="Cambria" w:hAnsi="Cambria" w:eastAsia="Cambria" w:cs="" w:asciiTheme="minorAscii" w:hAnsiTheme="minorAscii" w:eastAsiaTheme="minorAscii" w:cstheme="minorBidi"/>
-          <w:sz w:val="24"/>
-          <w:szCs w:val="24"/>
-          <w:lang w:val="en-GB"/>
-        </w:rPr>
-        <w:t>}</w:t>
+          <w:rFonts w:asciiTheme="minorHAnsi" w:eastAsiaTheme="minorHAnsi" w:hAnsiTheme="minorHAnsi" w:cstheme="minorBidi"/>
+          <w:sz w:val="24"/>
+          <w:szCs w:val="24"/>
+          <w:lang w:val="en-US"/>
+        </w:rPr>
+        <w:br/>
+      </w:r>
+      <w:r>
+        <w:rPr>
+          <w:rFonts w:asciiTheme="minorHAnsi" w:eastAsiaTheme="minorHAnsi" w:hAnsiTheme="minorHAnsi" w:cstheme="minorBidi"/>
+          <w:sz w:val="24"/>
+          <w:szCs w:val="24"/>
+          <w:lang w:val="en-US"/>
+        </w:rPr>
+        <w:t>:::{grid-item-card} Chapter 2</w:t>
+      </w:r>
+      <w:r>
+        <w:rPr>
+          <w:rFonts w:asciiTheme="minorHAnsi" w:eastAsiaTheme="minorHAnsi" w:hAnsiTheme="minorHAnsi" w:cstheme="minorBidi"/>
+          <w:sz w:val="24"/>
+          <w:szCs w:val="24"/>
+          <w:lang w:val="en-US"/>
+        </w:rPr>
+        <w:br/>
+      </w:r>
+      <w:r>
+        <w:rPr>
+          <w:rFonts w:asciiTheme="minorHAnsi" w:eastAsiaTheme="minorHAnsi" w:hAnsiTheme="minorHAnsi" w:cstheme="minorBidi"/>
+          <w:sz w:val="24"/>
+          <w:szCs w:val="24"/>
+          <w:lang w:val="en-US"/>
+        </w:rPr>
+        <w:t xml:space="preserve">:link: </w:t>
+      </w:r>
+      <w:r>
+        <w:rPr>
+          <w:rFonts w:asciiTheme="minorHAnsi" w:eastAsiaTheme="minorHAnsi" w:hAnsiTheme="minorHAnsi" w:cstheme="minorBidi"/>
+          <w:sz w:val="24"/>
+          <w:szCs w:val="24"/>
+          <w:lang w:val="en-US"/>
+        </w:rPr>
+        <w:t>05_</w:t>
+      </w:r>
+      <w:r>
+        <w:rPr>
+          <w:rFonts w:asciiTheme="minorHAnsi" w:eastAsiaTheme="minorHAnsi" w:hAnsiTheme="minorHAnsi" w:cstheme="minorBidi"/>
+          <w:sz w:val="24"/>
+          <w:szCs w:val="24"/>
+          <w:lang w:val="en-US"/>
+        </w:rPr>
+        <w:t>chapter-2-the-memorecord-experiment-a-study-in-digital-public-history</w:t>
+      </w:r>
+      <w:r>
+        <w:rPr>
+          <w:rFonts w:asciiTheme="minorHAnsi" w:eastAsiaTheme="minorHAnsi" w:hAnsiTheme="minorHAnsi" w:cstheme="minorBidi"/>
+          <w:sz w:val="24"/>
+          <w:szCs w:val="24"/>
+          <w:lang w:val="en-US"/>
+        </w:rPr>
+        <w:t>.html</w:t>
+      </w:r>
+      <w:r>
+        <w:rPr>
+          <w:rFonts w:asciiTheme="minorHAnsi" w:eastAsiaTheme="minorHAnsi" w:hAnsiTheme="minorHAnsi" w:cstheme="minorBidi"/>
+          <w:sz w:val="24"/>
+          <w:szCs w:val="24"/>
+          <w:lang w:val="en-US"/>
+        </w:rPr>
+        <w:br/>
+      </w:r>
+      <w:r>
+        <w:rPr>
+          <w:rFonts w:asciiTheme="minorHAnsi" w:eastAsiaTheme="minorHAnsi" w:hAnsiTheme="minorHAnsi" w:cstheme="minorBidi"/>
+          <w:sz w:val="24"/>
+          <w:szCs w:val="24"/>
+          <w:lang w:val="en-US"/>
+        </w:rPr>
+        <w:t xml:space="preserve">Chapter 2: The </w:t>
+      </w:r>
+      <w:proofErr w:type="spellStart"/>
+      <w:r>
+        <w:rPr>
+          <w:rFonts w:asciiTheme="minorHAnsi" w:eastAsiaTheme="minorHAnsi" w:hAnsiTheme="minorHAnsi" w:cstheme="minorBidi"/>
+          <w:sz w:val="24"/>
+          <w:szCs w:val="24"/>
+          <w:lang w:val="en-US"/>
+        </w:rPr>
+        <w:t>Memorecord</w:t>
+      </w:r>
+      <w:proofErr w:type="spellEnd"/>
+      <w:r>
+        <w:rPr>
+          <w:rFonts w:asciiTheme="minorHAnsi" w:eastAsiaTheme="minorHAnsi" w:hAnsiTheme="minorHAnsi" w:cstheme="minorBidi"/>
+          <w:sz w:val="24"/>
+          <w:szCs w:val="24"/>
+          <w:lang w:val="en-US"/>
+        </w:rPr>
+        <w:t xml:space="preserve"> Experiment: A Study in Digital Public History</w:t>
+      </w:r>
+      <w:r>
+        <w:rPr>
+          <w:rFonts w:asciiTheme="minorHAnsi" w:eastAsiaTheme="minorHAnsi" w:hAnsiTheme="minorHAnsi" w:cstheme="minorBidi"/>
+          <w:sz w:val="24"/>
+          <w:szCs w:val="24"/>
+          <w:lang w:val="en-US"/>
+        </w:rPr>
+        <w:br/>
+      </w:r>
+      <w:r>
+        <w:rPr>
+          <w:rFonts w:asciiTheme="minorHAnsi" w:eastAsiaTheme="minorHAnsi" w:hAnsiTheme="minorHAnsi" w:cstheme="minorBidi"/>
+          <w:sz w:val="24"/>
+          <w:szCs w:val="24"/>
+          <w:lang w:val="en-US"/>
+        </w:rPr>
+        <w:t>:::</w:t>
+      </w:r>
+      <w:r>
+        <w:rPr>
+          <w:rFonts w:asciiTheme="minorHAnsi" w:eastAsiaTheme="minorHAnsi" w:hAnsiTheme="minorHAnsi" w:cstheme="minorBidi"/>
+          <w:sz w:val="24"/>
+          <w:szCs w:val="24"/>
+          <w:lang w:val="en-US"/>
+        </w:rPr>
+        <w:br/>
+      </w:r>
+      <w:r>
+        <w:rPr>
+          <w:rFonts w:asciiTheme="minorHAnsi" w:eastAsiaTheme="minorHAnsi" w:hAnsiTheme="minorHAnsi" w:cstheme="minorBidi"/>
+          <w:sz w:val="24"/>
+          <w:szCs w:val="24"/>
+          <w:lang w:val="en-US"/>
+        </w:rPr>
+        <w:t>:::{grid-item-card} Chapter 3</w:t>
+      </w:r>
+      <w:r>
+        <w:rPr>
+          <w:rFonts w:asciiTheme="minorHAnsi" w:eastAsiaTheme="minorHAnsi" w:hAnsiTheme="minorHAnsi" w:cstheme="minorBidi"/>
+          <w:sz w:val="24"/>
+          <w:szCs w:val="24"/>
+          <w:lang w:val="en-US"/>
+        </w:rPr>
+        <w:br/>
+      </w:r>
+      <w:r>
+        <w:rPr>
+          <w:rFonts w:asciiTheme="minorHAnsi" w:eastAsiaTheme="minorHAnsi" w:hAnsiTheme="minorHAnsi" w:cstheme="minorBidi"/>
+          <w:sz w:val="24"/>
+          <w:szCs w:val="24"/>
+          <w:lang w:val="en-US"/>
+        </w:rPr>
+        <w:t xml:space="preserve">:link: </w:t>
+      </w:r>
+      <w:r>
+        <w:rPr>
+          <w:rFonts w:asciiTheme="minorHAnsi" w:eastAsiaTheme="minorHAnsi" w:hAnsiTheme="minorHAnsi" w:cstheme="minorBidi"/>
+          <w:sz w:val="24"/>
+          <w:szCs w:val="24"/>
+          <w:lang w:val="en-US"/>
+        </w:rPr>
+        <w:t>06_</w:t>
+      </w:r>
+      <w:r>
+        <w:rPr>
+          <w:rFonts w:asciiTheme="minorHAnsi" w:eastAsiaTheme="minorHAnsi" w:hAnsiTheme="minorHAnsi" w:cstheme="minorBidi"/>
+          <w:sz w:val="24"/>
+          <w:szCs w:val="24"/>
+          <w:lang w:val="en-US"/>
+        </w:rPr>
+        <w:t>chapter-3-analysing-digital-methods-a-return-to-hermeneutics</w:t>
+      </w:r>
+      <w:r>
+        <w:rPr>
+          <w:rFonts w:asciiTheme="minorHAnsi" w:eastAsiaTheme="minorHAnsi" w:hAnsiTheme="minorHAnsi" w:cstheme="minorBidi"/>
+          <w:sz w:val="24"/>
+          <w:szCs w:val="24"/>
+          <w:lang w:val="en-US"/>
+        </w:rPr>
+        <w:t>.html</w:t>
+      </w:r>
+      <w:r>
+        <w:rPr>
+          <w:rFonts w:asciiTheme="minorHAnsi" w:eastAsiaTheme="minorHAnsi" w:hAnsiTheme="minorHAnsi" w:cstheme="minorBidi"/>
+          <w:sz w:val="24"/>
+          <w:szCs w:val="24"/>
+          <w:lang w:val="en-US"/>
+        </w:rPr>
+        <w:br/>
+      </w:r>
+      <w:proofErr w:type="spellStart"/>
+      <w:r>
+        <w:rPr>
+          <w:rFonts w:asciiTheme="minorHAnsi" w:eastAsiaTheme="minorHAnsi" w:hAnsiTheme="minorHAnsi" w:cstheme="minorBidi"/>
+          <w:sz w:val="24"/>
+          <w:szCs w:val="24"/>
+          <w:lang w:val="en-US"/>
+        </w:rPr>
+        <w:t>Analysing</w:t>
+      </w:r>
+      <w:proofErr w:type="spellEnd"/>
+      <w:r>
+        <w:rPr>
+          <w:rFonts w:asciiTheme="minorHAnsi" w:eastAsiaTheme="minorHAnsi" w:hAnsiTheme="minorHAnsi" w:cstheme="minorBidi"/>
+          <w:sz w:val="24"/>
+          <w:szCs w:val="24"/>
+          <w:lang w:val="en-US"/>
+        </w:rPr>
+        <w:t xml:space="preserve"> Digital Methods – A Return to Hermeneutics</w:t>
+      </w:r>
+      <w:r>
+        <w:rPr>
+          <w:rFonts w:asciiTheme="minorHAnsi" w:eastAsiaTheme="minorHAnsi" w:hAnsiTheme="minorHAnsi" w:cstheme="minorBidi"/>
+          <w:sz w:val="24"/>
+          <w:szCs w:val="24"/>
+          <w:lang w:val="en-US"/>
+        </w:rPr>
+        <w:br/>
+      </w:r>
+      <w:r>
+        <w:rPr>
+          <w:rFonts w:asciiTheme="minorHAnsi" w:eastAsiaTheme="minorHAnsi" w:hAnsiTheme="minorHAnsi" w:cstheme="minorBidi"/>
+          <w:sz w:val="24"/>
+          <w:szCs w:val="24"/>
+          <w:lang w:val="en-US"/>
+        </w:rPr>
+        <w:t>:::</w:t>
+      </w:r>
+      <w:r>
+        <w:rPr>
+          <w:rFonts w:asciiTheme="minorHAnsi" w:eastAsiaTheme="minorHAnsi" w:hAnsiTheme="minorHAnsi" w:cstheme="minorBidi"/>
+          <w:sz w:val="24"/>
+          <w:szCs w:val="24"/>
+          <w:lang w:val="en-US"/>
+        </w:rPr>
+        <w:br/>
+      </w:r>
+      <w:r>
+        <w:rPr>
+          <w:rFonts w:asciiTheme="minorHAnsi" w:eastAsiaTheme="minorHAnsi" w:hAnsiTheme="minorHAnsi" w:cstheme="minorBidi"/>
+          <w:sz w:val="24"/>
+          <w:szCs w:val="24"/>
+          <w:lang w:val="en-US"/>
+        </w:rPr>
+        <w:t>:::{grid-item-card} Chapter 4</w:t>
+      </w:r>
+      <w:r>
+        <w:rPr>
+          <w:rFonts w:asciiTheme="minorHAnsi" w:eastAsiaTheme="minorHAnsi" w:hAnsiTheme="minorHAnsi" w:cstheme="minorBidi"/>
+          <w:sz w:val="24"/>
+          <w:szCs w:val="24"/>
+          <w:lang w:val="en-US"/>
+        </w:rPr>
+        <w:br/>
+      </w:r>
+      <w:r>
+        <w:rPr>
+          <w:rFonts w:asciiTheme="minorHAnsi" w:eastAsiaTheme="minorHAnsi" w:hAnsiTheme="minorHAnsi" w:cstheme="minorBidi"/>
+          <w:sz w:val="24"/>
+          <w:szCs w:val="24"/>
+          <w:lang w:val="en-US"/>
+        </w:rPr>
+        <w:t xml:space="preserve">:link: </w:t>
+      </w:r>
+      <w:r>
+        <w:rPr>
+          <w:rFonts w:asciiTheme="minorHAnsi" w:eastAsiaTheme="minorHAnsi" w:hAnsiTheme="minorHAnsi" w:cstheme="minorBidi"/>
+          <w:sz w:val="24"/>
+          <w:szCs w:val="24"/>
+          <w:lang w:val="en-US"/>
+        </w:rPr>
+        <w:t>07_</w:t>
+      </w:r>
+      <w:r>
+        <w:rPr>
+          <w:rFonts w:asciiTheme="minorHAnsi" w:eastAsiaTheme="minorHAnsi" w:hAnsiTheme="minorHAnsi" w:cstheme="minorBidi"/>
+          <w:sz w:val="24"/>
+          <w:szCs w:val="24"/>
+          <w:lang w:val="en-US"/>
+        </w:rPr>
+        <w:t>chapter-4-the-historians-kitchen-or-how-to-cook-your-memories</w:t>
+      </w:r>
+      <w:r>
+        <w:rPr>
+          <w:rFonts w:asciiTheme="minorHAnsi" w:eastAsiaTheme="minorHAnsi" w:hAnsiTheme="minorHAnsi" w:cstheme="minorBidi"/>
+          <w:sz w:val="24"/>
+          <w:szCs w:val="24"/>
+          <w:lang w:val="en-US"/>
+        </w:rPr>
+        <w:t>.html</w:t>
+      </w:r>
+      <w:r>
+        <w:rPr>
+          <w:rFonts w:asciiTheme="minorHAnsi" w:eastAsiaTheme="minorHAnsi" w:hAnsiTheme="minorHAnsi" w:cstheme="minorBidi"/>
+          <w:sz w:val="24"/>
+          <w:szCs w:val="24"/>
+          <w:lang w:val="en-US"/>
+        </w:rPr>
+        <w:br/>
+      </w:r>
+      <w:r>
+        <w:rPr>
+          <w:rFonts w:asciiTheme="minorHAnsi" w:eastAsiaTheme="minorHAnsi" w:hAnsiTheme="minorHAnsi" w:cstheme="minorBidi"/>
+          <w:sz w:val="24"/>
+          <w:szCs w:val="24"/>
+          <w:lang w:val="en-US"/>
+        </w:rPr>
+        <w:t>Chapter 4: The historian’s kitchen, or how to cook your memories?</w:t>
+      </w:r>
+      <w:r>
+        <w:rPr>
+          <w:rFonts w:asciiTheme="minorHAnsi" w:eastAsiaTheme="minorHAnsi" w:hAnsiTheme="minorHAnsi" w:cstheme="minorBidi"/>
+          <w:sz w:val="24"/>
+          <w:szCs w:val="24"/>
+          <w:lang w:val="en-US"/>
+        </w:rPr>
+        <w:br/>
+      </w:r>
+      <w:r>
+        <w:rPr>
+          <w:rFonts w:asciiTheme="minorHAnsi" w:eastAsiaTheme="minorHAnsi" w:hAnsiTheme="minorHAnsi" w:cstheme="minorBidi"/>
+          <w:sz w:val="24"/>
+          <w:szCs w:val="24"/>
+          <w:lang w:val="en-US"/>
+        </w:rPr>
+        <w:t>:::</w:t>
+      </w:r>
+      <w:r>
+        <w:rPr>
+          <w:rFonts w:asciiTheme="minorHAnsi" w:eastAsiaTheme="minorHAnsi" w:hAnsiTheme="minorHAnsi" w:cstheme="minorBidi"/>
+          <w:sz w:val="24"/>
+          <w:szCs w:val="24"/>
+          <w:lang w:val="en-US"/>
+        </w:rPr>
+        <w:br/>
+      </w:r>
+      <w:r>
+        <w:rPr>
+          <w:rFonts w:asciiTheme="minorHAnsi" w:eastAsiaTheme="minorHAnsi" w:hAnsiTheme="minorHAnsi" w:cstheme="minorBidi"/>
+          <w:sz w:val="24"/>
+          <w:szCs w:val="24"/>
+          <w:lang w:val="en-US"/>
+        </w:rPr>
+        <w:t>::::</w:t>
       </w:r>
     </w:p>
+    <w:p>
+      <w:pPr>
+        <w:rPr>
+          <w:lang w:val="en-US"/>
+        </w:rPr>
+      </w:pPr>
+    </w:p>
+    <w:p>
+      <w:pPr>
+        <w:pStyle w:val="Heading2"/>
+      </w:pPr>
+      <w:r>
+        <w:t>Table of Contents</w:t>
+      </w:r>
+    </w:p>
+    <w:p/>
     <w:p>
       <w:pPr>
         <w:shd w:val="clear" w:color="auto" w:fill="F6F8FA"/>
@@ -81,38 +540,40 @@
         </w:tabs>
         <w:spacing w:line="240" w:lineRule="auto"/>
         <w:rPr>
-          <w:rFonts w:asciiTheme="minorHAnsi" w:hAnsiTheme="minorHAnsi" w:eastAsiaTheme="minorHAnsi" w:cstheme="minorBidi"/>
-          <w:sz w:val="24"/>
-          <w:szCs w:val="24"/>
-          <w:lang w:val="en-US"/>
-        </w:rPr>
-      </w:pPr>
-      <w:r>
-        <w:rPr>
-          <w:rFonts w:asciiTheme="minorHAnsi" w:hAnsiTheme="minorHAnsi" w:eastAsiaTheme="minorHAnsi" w:cstheme="minorBidi"/>
-          <w:sz w:val="24"/>
-          <w:szCs w:val="24"/>
-          <w:lang w:val="en-US"/>
-        </w:rPr>
-        <w:t xml:space="preserve">TODO: paste some </w:t>
-      </w:r>
-      <w:r>
-        <w:rPr>
-          <w:rFonts w:asciiTheme="minorHAnsi" w:hAnsiTheme="minorHAnsi" w:eastAsiaTheme="minorHAnsi" w:cstheme="minorBidi"/>
-          <w:sz w:val="24"/>
-          <w:szCs w:val="24"/>
-          <w:lang w:val="en-US"/>
-        </w:rPr>
-        <w:t xml:space="preserve">image </w:t>
-      </w:r>
-      <w:r>
-        <w:rPr>
-          <w:rFonts w:asciiTheme="minorHAnsi" w:hAnsiTheme="minorHAnsi" w:eastAsiaTheme="minorHAnsi" w:cstheme="minorBidi"/>
-          <w:sz w:val="24"/>
-          <w:szCs w:val="24"/>
-          <w:lang w:val="en-US"/>
-        </w:rPr>
-        <w:t>using the {margin} directive</w:t>
+          <w:rFonts w:asciiTheme="minorHAnsi" w:eastAsiaTheme="minorHAnsi" w:hAnsiTheme="minorHAnsi" w:cstheme="minorBidi"/>
+          <w:sz w:val="24"/>
+          <w:szCs w:val="24"/>
+          <w:lang w:val="en-US"/>
+        </w:rPr>
+      </w:pPr>
+      <w:r>
+        <w:rPr>
+          <w:rFonts w:asciiTheme="minorHAnsi" w:eastAsiaTheme="minorHAnsi" w:hAnsiTheme="minorHAnsi" w:cstheme="minorBidi"/>
+          <w:sz w:val="24"/>
+          <w:szCs w:val="24"/>
+          <w:lang w:val="en-US"/>
+        </w:rPr>
+        <w:t>:::{</w:t>
+      </w:r>
+      <w:proofErr w:type="spellStart"/>
+      <w:r>
+        <w:rPr>
+          <w:rFonts w:asciiTheme="minorHAnsi" w:eastAsiaTheme="minorHAnsi" w:hAnsiTheme="minorHAnsi" w:cstheme="minorBidi"/>
+          <w:sz w:val="24"/>
+          <w:szCs w:val="24"/>
+          <w:lang w:val="en-US"/>
+        </w:rPr>
+        <w:t>tableofcontents</w:t>
+      </w:r>
+      <w:proofErr w:type="spellEnd"/>
+      <w:r>
+        <w:rPr>
+          <w:rFonts w:asciiTheme="minorHAnsi" w:eastAsiaTheme="minorHAnsi" w:hAnsiTheme="minorHAnsi" w:cstheme="minorBidi"/>
+          <w:sz w:val="24"/>
+          <w:szCs w:val="24"/>
+          <w:lang w:val="en-US"/>
+        </w:rPr>
+        <w:t>}</w:t>
       </w:r>
     </w:p>
     <w:p>
@@ -124,538 +585,15 @@
         </w:tabs>
         <w:spacing w:line="240" w:lineRule="auto"/>
         <w:rPr>
-          <w:rFonts w:asciiTheme="minorHAnsi" w:hAnsiTheme="minorHAnsi" w:eastAsiaTheme="minorHAnsi" w:cstheme="minorBidi"/>
-          <w:sz w:val="24"/>
-          <w:szCs w:val="24"/>
-          <w:lang w:val="en-US"/>
-        </w:rPr>
-      </w:pPr>
-      <w:r>
-        <w:rPr>
-          <w:rFonts w:asciiTheme="minorHAnsi" w:hAnsiTheme="minorHAnsi" w:eastAsiaTheme="minorHAnsi" w:cstheme="minorBidi"/>
-          <w:sz w:val="24"/>
-          <w:szCs w:val="24"/>
-          <w:lang w:val="en-US"/>
-        </w:rPr>
-        <w:t>:::</w:t>
-      </w:r>
-    </w:p>
-    <w:p/>
-    <w:p>
-      <w:pPr>
-        <w:shd w:val="clear" w:color="auto" w:fill="F6F8FA"/>
-        <w:tabs>
-          <w:tab w:val="left" w:pos="916"/>
-          <w:tab w:val="left" w:pos="3731"/>
-        </w:tabs>
-        <w:spacing w:line="240" w:lineRule="auto"/>
-        <w:rPr>
-          <w:rFonts w:asciiTheme="minorHAnsi" w:hAnsiTheme="minorHAnsi" w:eastAsiaTheme="minorHAnsi" w:cstheme="minorBidi"/>
-          <w:sz w:val="24"/>
-          <w:szCs w:val="24"/>
-          <w:lang w:val="en-US"/>
-        </w:rPr>
-      </w:pPr>
-      <w:r>
-        <w:rPr>
-          <w:rFonts w:asciiTheme="minorHAnsi" w:hAnsiTheme="minorHAnsi" w:eastAsiaTheme="minorHAnsi" w:cstheme="minorBidi"/>
-          <w:sz w:val="24"/>
-          <w:szCs w:val="24"/>
-          <w:lang w:val="en-US"/>
-        </w:rPr>
-        <w:t>::::{grid}</w:t>
-      </w:r>
-      <w:r>
-        <w:rPr>
-          <w:rFonts w:asciiTheme="minorHAnsi" w:hAnsiTheme="minorHAnsi" w:eastAsiaTheme="minorHAnsi" w:cstheme="minorBidi"/>
-          <w:sz w:val="24"/>
-          <w:szCs w:val="24"/>
-          <w:lang w:val="en-US"/>
-        </w:rPr>
-        <w:br/>
-      </w:r>
-      <w:r>
-        <w:rPr>
-          <w:rFonts w:asciiTheme="minorHAnsi" w:hAnsiTheme="minorHAnsi" w:eastAsiaTheme="minorHAnsi" w:cstheme="minorBidi"/>
-          <w:sz w:val="24"/>
-          <w:szCs w:val="24"/>
-          <w:lang w:val="en-US"/>
-        </w:rPr>
-        <w:t>:gutter: 3</w:t>
-      </w:r>
-      <w:r>
-        <w:rPr>
-          <w:rFonts w:asciiTheme="minorHAnsi" w:hAnsiTheme="minorHAnsi" w:eastAsiaTheme="minorHAnsi" w:cstheme="minorBidi"/>
-          <w:sz w:val="24"/>
-          <w:szCs w:val="24"/>
-          <w:lang w:val="en-US"/>
-        </w:rPr>
-        <w:br/>
-      </w:r>
-      <w:r>
-        <w:rPr>
-          <w:rFonts w:asciiTheme="minorHAnsi" w:hAnsiTheme="minorHAnsi" w:eastAsiaTheme="minorHAnsi" w:cstheme="minorBidi"/>
-          <w:sz w:val="24"/>
-          <w:szCs w:val="24"/>
-          <w:lang w:val="en-US"/>
-        </w:rPr>
-        <w:t>:::{grid-item-card} Chapter 1</w:t>
-      </w:r>
-      <w:r>
-        <w:rPr>
-          <w:rFonts w:asciiTheme="minorHAnsi" w:hAnsiTheme="minorHAnsi" w:eastAsiaTheme="minorHAnsi" w:cstheme="minorBidi"/>
-          <w:sz w:val="24"/>
-          <w:szCs w:val="24"/>
-          <w:lang w:val="en-US"/>
-        </w:rPr>
-        <w:br/>
-      </w:r>
-      <w:r>
-        <w:rPr>
-          <w:rFonts w:asciiTheme="minorHAnsi" w:hAnsiTheme="minorHAnsi" w:eastAsiaTheme="minorHAnsi" w:cstheme="minorBidi"/>
-          <w:sz w:val="24"/>
-          <w:szCs w:val="24"/>
-          <w:lang w:val="en-US"/>
-        </w:rPr>
-        <w:t xml:space="preserve">:link: </w:t>
-      </w:r>
-      <w:r>
-        <w:rPr>
-          <w:rFonts w:asciiTheme="minorHAnsi" w:hAnsiTheme="minorHAnsi" w:eastAsiaTheme="minorHAnsi" w:cstheme="minorBidi"/>
-          <w:sz w:val="24"/>
-          <w:szCs w:val="24"/>
-          <w:lang w:val="en-US"/>
-        </w:rPr>
-        <w:t>04_</w:t>
-      </w:r>
-      <w:r>
-        <w:rPr>
-          <w:rFonts w:asciiTheme="minorHAnsi" w:hAnsiTheme="minorHAnsi" w:eastAsiaTheme="minorHAnsi" w:cstheme="minorBidi"/>
-          <w:sz w:val="24"/>
-          <w:szCs w:val="24"/>
-        </w:rPr>
-        <w:t>chapter-1-epistemic-virtues-and-the-foundations-of-historical-practice</w:t>
-      </w:r>
-      <w:r>
-        <w:rPr>
-          <w:rFonts w:asciiTheme="minorHAnsi" w:hAnsiTheme="minorHAnsi" w:eastAsiaTheme="minorHAnsi" w:cstheme="minorBidi"/>
-          <w:sz w:val="24"/>
-          <w:szCs w:val="24"/>
-          <w:lang w:val="en-US"/>
-        </w:rPr>
-        <w:t>.html</w:t>
-      </w:r>
-      <w:r>
-        <w:rPr>
-          <w:rFonts w:asciiTheme="minorHAnsi" w:hAnsiTheme="minorHAnsi" w:eastAsiaTheme="minorHAnsi" w:cstheme="minorBidi"/>
-          <w:sz w:val="24"/>
-          <w:szCs w:val="24"/>
-          <w:lang w:val="en-US"/>
-        </w:rPr>
-        <w:br/>
-      </w:r>
-      <w:r>
-        <w:rPr>
-          <w:rFonts w:asciiTheme="minorHAnsi" w:hAnsiTheme="minorHAnsi" w:eastAsiaTheme="minorHAnsi" w:cstheme="minorBidi"/>
-          <w:sz w:val="24"/>
-          <w:szCs w:val="24"/>
-          <w:lang w:val="en-US"/>
-        </w:rPr>
-        <w:t>Chapter 1: Epistemic Virtues and the Foundations of Historical Practice</w:t>
-      </w:r>
-      <w:r>
-        <w:rPr>
-          <w:rFonts w:asciiTheme="minorHAnsi" w:hAnsiTheme="minorHAnsi" w:eastAsiaTheme="minorHAnsi" w:cstheme="minorBidi"/>
-          <w:sz w:val="24"/>
-          <w:szCs w:val="24"/>
-          <w:lang w:val="en-US"/>
-        </w:rPr>
-        <w:br/>
-      </w:r>
-      <w:r>
-        <w:rPr>
-          <w:rFonts w:asciiTheme="minorHAnsi" w:hAnsiTheme="minorHAnsi" w:eastAsiaTheme="minorHAnsi" w:cstheme="minorBidi"/>
-          <w:sz w:val="24"/>
-          <w:szCs w:val="24"/>
-          <w:lang w:val="en-US"/>
-        </w:rPr>
-        <w:t>:::</w:t>
-      </w:r>
-      <w:r>
-        <w:rPr>
-          <w:rFonts w:asciiTheme="minorHAnsi" w:hAnsiTheme="minorHAnsi" w:eastAsiaTheme="minorHAnsi" w:cstheme="minorBidi"/>
-          <w:sz w:val="24"/>
-          <w:szCs w:val="24"/>
-          <w:lang w:val="en-US"/>
-        </w:rPr>
-        <w:br/>
-      </w:r>
-      <w:r>
-        <w:rPr>
-          <w:rFonts w:asciiTheme="minorHAnsi" w:hAnsiTheme="minorHAnsi" w:eastAsiaTheme="minorHAnsi" w:cstheme="minorBidi"/>
-          <w:sz w:val="24"/>
-          <w:szCs w:val="24"/>
-          <w:lang w:val="en-US"/>
-        </w:rPr>
-        <w:t>:::{grid-item-card} Chapter 2</w:t>
-      </w:r>
-      <w:r>
-        <w:rPr>
-          <w:rFonts w:asciiTheme="minorHAnsi" w:hAnsiTheme="minorHAnsi" w:eastAsiaTheme="minorHAnsi" w:cstheme="minorBidi"/>
-          <w:sz w:val="24"/>
-          <w:szCs w:val="24"/>
-          <w:lang w:val="en-US"/>
-        </w:rPr>
-        <w:br/>
-      </w:r>
-      <w:r>
-        <w:rPr>
-          <w:rFonts w:asciiTheme="minorHAnsi" w:hAnsiTheme="minorHAnsi" w:eastAsiaTheme="minorHAnsi" w:cstheme="minorBidi"/>
-          <w:sz w:val="24"/>
-          <w:szCs w:val="24"/>
-          <w:lang w:val="en-US"/>
-        </w:rPr>
-        <w:t xml:space="preserve">:link: </w:t>
-      </w:r>
-      <w:r>
-        <w:rPr>
-          <w:rFonts w:asciiTheme="minorHAnsi" w:hAnsiTheme="minorHAnsi" w:eastAsiaTheme="minorHAnsi" w:cstheme="minorBidi"/>
-          <w:sz w:val="24"/>
-          <w:szCs w:val="24"/>
-          <w:lang w:val="en-US"/>
-        </w:rPr>
-        <w:t>05_</w:t>
-      </w:r>
-      <w:r>
-        <w:rPr>
-          <w:rFonts w:asciiTheme="minorHAnsi" w:hAnsiTheme="minorHAnsi" w:eastAsiaTheme="minorHAnsi" w:cstheme="minorBidi"/>
-          <w:sz w:val="24"/>
-          <w:szCs w:val="24"/>
-          <w:lang w:val="en-US"/>
-        </w:rPr>
-        <w:t>chapter-2-the-memorecord-experiment-a-study-in-digital-public-history</w:t>
-      </w:r>
-      <w:r>
-        <w:rPr>
-          <w:rFonts w:asciiTheme="minorHAnsi" w:hAnsiTheme="minorHAnsi" w:eastAsiaTheme="minorHAnsi" w:cstheme="minorBidi"/>
-          <w:sz w:val="24"/>
-          <w:szCs w:val="24"/>
-          <w:lang w:val="en-US"/>
-        </w:rPr>
-        <w:t>.html</w:t>
-      </w:r>
-      <w:r>
-        <w:rPr>
-          <w:rFonts w:asciiTheme="minorHAnsi" w:hAnsiTheme="minorHAnsi" w:eastAsiaTheme="minorHAnsi" w:cstheme="minorBidi"/>
-          <w:sz w:val="24"/>
-          <w:szCs w:val="24"/>
-          <w:lang w:val="en-US"/>
-        </w:rPr>
-        <w:br/>
-      </w:r>
-      <w:r>
-        <w:rPr>
-          <w:rFonts w:asciiTheme="minorHAnsi" w:hAnsiTheme="minorHAnsi" w:eastAsiaTheme="minorHAnsi" w:cstheme="minorBidi"/>
-          <w:sz w:val="24"/>
-          <w:szCs w:val="24"/>
-          <w:lang w:val="en-US"/>
-        </w:rPr>
-        <w:t>Chapter 2: The Memorecord Experiment: A Study in Digital Public History</w:t>
-      </w:r>
-      <w:r>
-        <w:rPr>
-          <w:rFonts w:asciiTheme="minorHAnsi" w:hAnsiTheme="minorHAnsi" w:eastAsiaTheme="minorHAnsi" w:cstheme="minorBidi"/>
-          <w:sz w:val="24"/>
-          <w:szCs w:val="24"/>
-          <w:lang w:val="en-US"/>
-        </w:rPr>
-        <w:br/>
-      </w:r>
-      <w:r>
-        <w:rPr>
-          <w:rFonts w:asciiTheme="minorHAnsi" w:hAnsiTheme="minorHAnsi" w:eastAsiaTheme="minorHAnsi" w:cstheme="minorBidi"/>
-          <w:sz w:val="24"/>
-          <w:szCs w:val="24"/>
-          <w:lang w:val="en-US"/>
-        </w:rPr>
-        <w:t>:::</w:t>
-      </w:r>
-      <w:r>
-        <w:rPr>
-          <w:rFonts w:asciiTheme="minorHAnsi" w:hAnsiTheme="minorHAnsi" w:eastAsiaTheme="minorHAnsi" w:cstheme="minorBidi"/>
-          <w:sz w:val="24"/>
-          <w:szCs w:val="24"/>
-          <w:lang w:val="en-US"/>
-        </w:rPr>
-        <w:br/>
-      </w:r>
-      <w:r>
-        <w:rPr>
-          <w:rFonts w:asciiTheme="minorHAnsi" w:hAnsiTheme="minorHAnsi" w:eastAsiaTheme="minorHAnsi" w:cstheme="minorBidi"/>
-          <w:sz w:val="24"/>
-          <w:szCs w:val="24"/>
-          <w:lang w:val="en-US"/>
-        </w:rPr>
-        <w:t>:::{grid-item-card} Chapter 3</w:t>
-      </w:r>
-      <w:r>
-        <w:rPr>
-          <w:rFonts w:asciiTheme="minorHAnsi" w:hAnsiTheme="minorHAnsi" w:eastAsiaTheme="minorHAnsi" w:cstheme="minorBidi"/>
-          <w:sz w:val="24"/>
-          <w:szCs w:val="24"/>
-          <w:lang w:val="en-US"/>
-        </w:rPr>
-        <w:br/>
-      </w:r>
-      <w:r>
-        <w:rPr>
-          <w:rFonts w:asciiTheme="minorHAnsi" w:hAnsiTheme="minorHAnsi" w:eastAsiaTheme="minorHAnsi" w:cstheme="minorBidi"/>
-          <w:sz w:val="24"/>
-          <w:szCs w:val="24"/>
-          <w:lang w:val="en-US"/>
-        </w:rPr>
-        <w:t xml:space="preserve">:link: </w:t>
-      </w:r>
-      <w:r>
-        <w:rPr>
-          <w:rFonts w:asciiTheme="minorHAnsi" w:hAnsiTheme="minorHAnsi" w:eastAsiaTheme="minorHAnsi" w:cstheme="minorBidi"/>
-          <w:sz w:val="24"/>
-          <w:szCs w:val="24"/>
-          <w:lang w:val="en-US"/>
-        </w:rPr>
-        <w:t>06_</w:t>
-      </w:r>
-      <w:r>
-        <w:rPr>
-          <w:rFonts w:asciiTheme="minorHAnsi" w:hAnsiTheme="minorHAnsi" w:eastAsiaTheme="minorHAnsi" w:cstheme="minorBidi"/>
-          <w:sz w:val="24"/>
-          <w:szCs w:val="24"/>
-          <w:lang w:val="en-US"/>
-        </w:rPr>
-        <w:t>chapter-3-analysing-digital-methods-a-return-to-hermeneutics</w:t>
-      </w:r>
-      <w:r>
-        <w:rPr>
-          <w:rFonts w:asciiTheme="minorHAnsi" w:hAnsiTheme="minorHAnsi" w:eastAsiaTheme="minorHAnsi" w:cstheme="minorBidi"/>
-          <w:sz w:val="24"/>
-          <w:szCs w:val="24"/>
-          <w:lang w:val="en-US"/>
-        </w:rPr>
-        <w:t>.html</w:t>
-      </w:r>
-      <w:r>
-        <w:rPr>
-          <w:rFonts w:asciiTheme="minorHAnsi" w:hAnsiTheme="minorHAnsi" w:eastAsiaTheme="minorHAnsi" w:cstheme="minorBidi"/>
-          <w:sz w:val="24"/>
-          <w:szCs w:val="24"/>
-          <w:lang w:val="en-US"/>
-        </w:rPr>
-        <w:br/>
-      </w:r>
-      <w:r>
-        <w:rPr>
-          <w:rFonts w:asciiTheme="minorHAnsi" w:hAnsiTheme="minorHAnsi" w:eastAsiaTheme="minorHAnsi" w:cstheme="minorBidi"/>
-          <w:sz w:val="24"/>
-          <w:szCs w:val="24"/>
-          <w:lang w:val="en-US"/>
-        </w:rPr>
-        <w:t>Analysing Digital Methods – A Return to Hermeneutics</w:t>
-      </w:r>
-      <w:r>
-        <w:rPr>
-          <w:rFonts w:asciiTheme="minorHAnsi" w:hAnsiTheme="minorHAnsi" w:eastAsiaTheme="minorHAnsi" w:cstheme="minorBidi"/>
-          <w:sz w:val="24"/>
-          <w:szCs w:val="24"/>
-          <w:lang w:val="en-US"/>
-        </w:rPr>
-        <w:br/>
-      </w:r>
-      <w:r>
-        <w:rPr>
-          <w:rFonts w:asciiTheme="minorHAnsi" w:hAnsiTheme="minorHAnsi" w:eastAsiaTheme="minorHAnsi" w:cstheme="minorBidi"/>
-          <w:sz w:val="24"/>
-          <w:szCs w:val="24"/>
-          <w:lang w:val="en-US"/>
-        </w:rPr>
-        <w:t>:::</w:t>
-      </w:r>
-      <w:r>
-        <w:rPr>
-          <w:rFonts w:asciiTheme="minorHAnsi" w:hAnsiTheme="minorHAnsi" w:eastAsiaTheme="minorHAnsi" w:cstheme="minorBidi"/>
-          <w:sz w:val="24"/>
-          <w:szCs w:val="24"/>
-          <w:lang w:val="en-US"/>
-        </w:rPr>
-        <w:br/>
-      </w:r>
-      <w:r>
-        <w:rPr>
-          <w:rFonts w:asciiTheme="minorHAnsi" w:hAnsiTheme="minorHAnsi" w:eastAsiaTheme="minorHAnsi" w:cstheme="minorBidi"/>
-          <w:sz w:val="24"/>
-          <w:szCs w:val="24"/>
-          <w:lang w:val="en-US"/>
-        </w:rPr>
-        <w:t>:::{grid-item-card} Chapter 4</w:t>
-      </w:r>
-      <w:r>
-        <w:rPr>
-          <w:rFonts w:asciiTheme="minorHAnsi" w:hAnsiTheme="minorHAnsi" w:eastAsiaTheme="minorHAnsi" w:cstheme="minorBidi"/>
-          <w:sz w:val="24"/>
-          <w:szCs w:val="24"/>
-          <w:lang w:val="en-US"/>
-        </w:rPr>
-        <w:br/>
-      </w:r>
-      <w:r>
-        <w:rPr>
-          <w:rFonts w:asciiTheme="minorHAnsi" w:hAnsiTheme="minorHAnsi" w:eastAsiaTheme="minorHAnsi" w:cstheme="minorBidi"/>
-          <w:sz w:val="24"/>
-          <w:szCs w:val="24"/>
-          <w:lang w:val="en-US"/>
-        </w:rPr>
-        <w:t xml:space="preserve">:link: </w:t>
-      </w:r>
-      <w:r>
-        <w:rPr>
-          <w:rFonts w:asciiTheme="minorHAnsi" w:hAnsiTheme="minorHAnsi" w:eastAsiaTheme="minorHAnsi" w:cstheme="minorBidi"/>
-          <w:sz w:val="24"/>
-          <w:szCs w:val="24"/>
-          <w:lang w:val="en-US"/>
-        </w:rPr>
-        <w:t>07_</w:t>
-      </w:r>
-      <w:r>
-        <w:rPr>
-          <w:rFonts w:asciiTheme="minorHAnsi" w:hAnsiTheme="minorHAnsi" w:eastAsiaTheme="minorHAnsi" w:cstheme="minorBidi"/>
-          <w:sz w:val="24"/>
-          <w:szCs w:val="24"/>
-          <w:lang w:val="en-US"/>
-        </w:rPr>
-        <w:t>chapter-4-the-historians-kitchen-or-how-to-cook-your-memories</w:t>
-      </w:r>
-      <w:r>
-        <w:rPr>
-          <w:rFonts w:asciiTheme="minorHAnsi" w:hAnsiTheme="minorHAnsi" w:eastAsiaTheme="minorHAnsi" w:cstheme="minorBidi"/>
-          <w:sz w:val="24"/>
-          <w:szCs w:val="24"/>
-          <w:lang w:val="en-US"/>
-        </w:rPr>
-        <w:t>.html</w:t>
-      </w:r>
-      <w:r>
-        <w:rPr>
-          <w:rFonts w:asciiTheme="minorHAnsi" w:hAnsiTheme="minorHAnsi" w:eastAsiaTheme="minorHAnsi" w:cstheme="minorBidi"/>
-          <w:sz w:val="24"/>
-          <w:szCs w:val="24"/>
-          <w:lang w:val="en-US"/>
-        </w:rPr>
-        <w:br/>
-      </w:r>
-      <w:r>
-        <w:rPr>
-          <w:rFonts w:asciiTheme="minorHAnsi" w:hAnsiTheme="minorHAnsi" w:eastAsiaTheme="minorHAnsi" w:cstheme="minorBidi"/>
-          <w:sz w:val="24"/>
-          <w:szCs w:val="24"/>
-          <w:lang w:val="en-US"/>
-        </w:rPr>
-        <w:t>Chapter 4: The historian’s kitchen, or how to cook your memories?</w:t>
-      </w:r>
-      <w:r>
-        <w:rPr>
-          <w:rFonts w:asciiTheme="minorHAnsi" w:hAnsiTheme="minorHAnsi" w:eastAsiaTheme="minorHAnsi" w:cstheme="minorBidi"/>
-          <w:sz w:val="24"/>
-          <w:szCs w:val="24"/>
-          <w:lang w:val="en-US"/>
-        </w:rPr>
-        <w:br/>
-      </w:r>
-      <w:r>
-        <w:rPr>
-          <w:rFonts w:asciiTheme="minorHAnsi" w:hAnsiTheme="minorHAnsi" w:eastAsiaTheme="minorHAnsi" w:cstheme="minorBidi"/>
-          <w:sz w:val="24"/>
-          <w:szCs w:val="24"/>
-          <w:lang w:val="en-US"/>
-        </w:rPr>
-        <w:t>:::</w:t>
-      </w:r>
-      <w:r>
-        <w:rPr>
-          <w:rFonts w:asciiTheme="minorHAnsi" w:hAnsiTheme="minorHAnsi" w:eastAsiaTheme="minorHAnsi" w:cstheme="minorBidi"/>
-          <w:sz w:val="24"/>
-          <w:szCs w:val="24"/>
-          <w:lang w:val="en-US"/>
-        </w:rPr>
-        <w:br/>
-      </w:r>
-      <w:r>
-        <w:rPr>
-          <w:rFonts w:asciiTheme="minorHAnsi" w:hAnsiTheme="minorHAnsi" w:eastAsiaTheme="minorHAnsi" w:cstheme="minorBidi"/>
-          <w:sz w:val="24"/>
-          <w:szCs w:val="24"/>
-          <w:lang w:val="en-US"/>
-        </w:rPr>
-        <w:t>::::</w:t>
-      </w:r>
-    </w:p>
-    <w:p>
-      <w:pPr>
-        <w:rPr>
-          <w:lang w:val="en-US"/>
-        </w:rPr>
-      </w:pPr>
-    </w:p>
-    <w:p>
-      <w:pPr>
-        <w:pStyle w:val="Heading2"/>
-      </w:pPr>
-      <w:r>
-        <w:t>Table of Contents</w:t>
-      </w:r>
-    </w:p>
-    <w:p/>
-    <w:p>
-      <w:pPr>
-        <w:shd w:val="clear" w:color="auto" w:fill="F6F8FA"/>
-        <w:tabs>
-          <w:tab w:val="left" w:pos="916"/>
-          <w:tab w:val="left" w:pos="3731"/>
-        </w:tabs>
-        <w:spacing w:line="240" w:lineRule="auto"/>
-        <w:rPr>
-          <w:rFonts w:asciiTheme="minorHAnsi" w:hAnsiTheme="minorHAnsi" w:eastAsiaTheme="minorHAnsi" w:cstheme="minorBidi"/>
-          <w:sz w:val="24"/>
-          <w:szCs w:val="24"/>
-          <w:lang w:val="en-US"/>
-        </w:rPr>
-      </w:pPr>
-      <w:r>
-        <w:rPr>
-          <w:rFonts w:asciiTheme="minorHAnsi" w:hAnsiTheme="minorHAnsi" w:eastAsiaTheme="minorHAnsi" w:cstheme="minorBidi"/>
-          <w:sz w:val="24"/>
-          <w:szCs w:val="24"/>
-          <w:lang w:val="en-US"/>
-        </w:rPr>
-        <w:t>:::{tableofcontents}</w:t>
-      </w:r>
-    </w:p>
-    <w:p>
-      <w:pPr>
-        <w:shd w:val="clear" w:color="auto" w:fill="F6F8FA"/>
-        <w:tabs>
-          <w:tab w:val="left" w:pos="916"/>
-          <w:tab w:val="left" w:pos="3731"/>
-        </w:tabs>
-        <w:spacing w:line="240" w:lineRule="auto"/>
-        <w:rPr>
-          <w:rFonts w:asciiTheme="minorHAnsi" w:hAnsiTheme="minorHAnsi" w:eastAsiaTheme="minorHAnsi" w:cstheme="minorBidi"/>
-          <w:sz w:val="24"/>
-          <w:szCs w:val="24"/>
-          <w:lang w:val="en-US"/>
-        </w:rPr>
-      </w:pPr>
-      <w:r>
-        <w:rPr>
-          <w:rFonts w:asciiTheme="minorHAnsi" w:hAnsiTheme="minorHAnsi" w:eastAsiaTheme="minorHAnsi" w:cstheme="minorBidi"/>
+          <w:rFonts w:asciiTheme="minorHAnsi" w:eastAsiaTheme="minorHAnsi" w:hAnsiTheme="minorHAnsi" w:cstheme="minorBidi"/>
+          <w:sz w:val="24"/>
+          <w:szCs w:val="24"/>
+          <w:lang w:val="en-US"/>
+        </w:rPr>
+      </w:pPr>
+      <w:r>
+        <w:rPr>
+          <w:rFonts w:asciiTheme="minorHAnsi" w:eastAsiaTheme="minorHAnsi" w:hAnsiTheme="minorHAnsi" w:cstheme="minorBidi"/>
           <w:sz w:val="24"/>
           <w:szCs w:val="24"/>
           <w:lang w:val="en-US"/>
@@ -673,7 +611,7 @@
     <w:p/>
     <w:p/>
     <w:sectPr>
-      <w:pgSz w:w="11900" w:h="16840" w:orient="portrait" w:code="9"/>
+      <w:pgSz w:w="11900" w:h="16840" w:code="9"/>
       <w:pgMar w:top="1701" w:right="1797" w:bottom="539" w:left="1797" w:header="720" w:footer="720" w:gutter="0"/>
       <w:pgNumType w:fmt="lowerRoman" w:start="1" w:chapSep="emDash"/>
       <w:cols w:space="720"/>
@@ -827,7 +765,7 @@
         <w:ind w:left="720" w:hanging="360"/>
       </w:pPr>
       <w:rPr>
-        <w:rFonts w:ascii="Verdana" w:hAnsi="Verdana" w:eastAsia="Verdana" w:cs="Verdana"/>
+        <w:rFonts w:ascii="Verdana" w:eastAsia="Verdana" w:hAnsi="Verdana" w:cs="Verdana"/>
         <w:sz w:val="18"/>
         <w:szCs w:val="18"/>
       </w:rPr>
@@ -1348,7 +1286,7 @@
   <w:docDefaults>
     <w:rPrDefault>
       <w:rPr>
-        <w:rFonts w:ascii="Arial" w:hAnsi="Arial" w:eastAsia="Arial" w:cs="Arial"/>
+        <w:rFonts w:ascii="Arial" w:eastAsia="Arial" w:hAnsi="Arial" w:cs="Arial"/>
         <w:sz w:val="22"/>
         <w:szCs w:val="22"/>
         <w:lang w:val="en-GB" w:eastAsia="en-US" w:bidi="ar-SA"/>
@@ -1363,14 +1301,14 @@
   <w:latentStyles w:defLockedState="0" w:defUIPriority="99" w:defSemiHidden="0" w:defUnhideWhenUsed="0" w:defQFormat="0" w:count="376">
     <w:lsdException w:name="Normal" w:uiPriority="0" w:qFormat="1"/>
     <w:lsdException w:name="heading 1" w:uiPriority="9" w:qFormat="1"/>
-    <w:lsdException w:name="heading 2" w:uiPriority="9" w:semiHidden="1" w:unhideWhenUsed="1" w:qFormat="1"/>
-    <w:lsdException w:name="heading 3" w:uiPriority="9" w:semiHidden="1" w:unhideWhenUsed="1" w:qFormat="1"/>
-    <w:lsdException w:name="heading 4" w:uiPriority="9" w:semiHidden="1" w:unhideWhenUsed="1" w:qFormat="1"/>
-    <w:lsdException w:name="heading 5" w:uiPriority="9" w:semiHidden="1" w:unhideWhenUsed="1" w:qFormat="1"/>
-    <w:lsdException w:name="heading 6" w:uiPriority="9" w:semiHidden="1" w:unhideWhenUsed="1" w:qFormat="1"/>
-    <w:lsdException w:name="heading 7" w:uiPriority="9" w:semiHidden="1" w:unhideWhenUsed="1" w:qFormat="1"/>
-    <w:lsdException w:name="heading 8" w:uiPriority="9" w:semiHidden="1" w:unhideWhenUsed="1" w:qFormat="1"/>
-    <w:lsdException w:name="heading 9" w:uiPriority="9" w:semiHidden="1" w:unhideWhenUsed="1" w:qFormat="1"/>
+    <w:lsdException w:name="heading 2" w:semiHidden="1" w:uiPriority="9" w:unhideWhenUsed="1" w:qFormat="1"/>
+    <w:lsdException w:name="heading 3" w:semiHidden="1" w:uiPriority="9" w:unhideWhenUsed="1" w:qFormat="1"/>
+    <w:lsdException w:name="heading 4" w:semiHidden="1" w:uiPriority="9" w:unhideWhenUsed="1" w:qFormat="1"/>
+    <w:lsdException w:name="heading 5" w:semiHidden="1" w:uiPriority="9" w:unhideWhenUsed="1" w:qFormat="1"/>
+    <w:lsdException w:name="heading 6" w:semiHidden="1" w:uiPriority="9" w:unhideWhenUsed="1" w:qFormat="1"/>
+    <w:lsdException w:name="heading 7" w:semiHidden="1" w:uiPriority="9" w:unhideWhenUsed="1" w:qFormat="1"/>
+    <w:lsdException w:name="heading 8" w:semiHidden="1" w:uiPriority="9" w:unhideWhenUsed="1" w:qFormat="1"/>
+    <w:lsdException w:name="heading 9" w:semiHidden="1" w:uiPriority="9" w:unhideWhenUsed="1" w:qFormat="1"/>
     <w:lsdException w:name="index 1" w:semiHidden="1" w:unhideWhenUsed="1"/>
     <w:lsdException w:name="index 2" w:semiHidden="1" w:unhideWhenUsed="1"/>
     <w:lsdException w:name="index 3" w:semiHidden="1" w:unhideWhenUsed="1"/>
@@ -1380,26 +1318,26 @@
     <w:lsdException w:name="index 7" w:semiHidden="1" w:unhideWhenUsed="1"/>
     <w:lsdException w:name="index 8" w:semiHidden="1" w:unhideWhenUsed="1"/>
     <w:lsdException w:name="index 9" w:semiHidden="1" w:unhideWhenUsed="1"/>
-    <w:lsdException w:name="toc 1" w:uiPriority="39" w:semiHidden="1" w:unhideWhenUsed="1"/>
-    <w:lsdException w:name="toc 2" w:uiPriority="39" w:semiHidden="1" w:unhideWhenUsed="1"/>
-    <w:lsdException w:name="toc 3" w:uiPriority="39" w:semiHidden="1" w:unhideWhenUsed="1"/>
-    <w:lsdException w:name="toc 4" w:uiPriority="39" w:semiHidden="1" w:unhideWhenUsed="1"/>
-    <w:lsdException w:name="toc 5" w:uiPriority="39" w:semiHidden="1" w:unhideWhenUsed="1"/>
-    <w:lsdException w:name="toc 6" w:uiPriority="39" w:semiHidden="1" w:unhideWhenUsed="1"/>
-    <w:lsdException w:name="toc 7" w:uiPriority="39" w:semiHidden="1" w:unhideWhenUsed="1"/>
-    <w:lsdException w:name="toc 8" w:uiPriority="39" w:semiHidden="1" w:unhideWhenUsed="1"/>
-    <w:lsdException w:name="toc 9" w:uiPriority="39" w:semiHidden="1" w:unhideWhenUsed="1"/>
+    <w:lsdException w:name="toc 1" w:semiHidden="1" w:uiPriority="39" w:unhideWhenUsed="1"/>
+    <w:lsdException w:name="toc 2" w:semiHidden="1" w:uiPriority="39" w:unhideWhenUsed="1"/>
+    <w:lsdException w:name="toc 3" w:semiHidden="1" w:uiPriority="39" w:unhideWhenUsed="1"/>
+    <w:lsdException w:name="toc 4" w:semiHidden="1" w:uiPriority="39" w:unhideWhenUsed="1"/>
+    <w:lsdException w:name="toc 5" w:semiHidden="1" w:uiPriority="39" w:unhideWhenUsed="1"/>
+    <w:lsdException w:name="toc 6" w:semiHidden="1" w:uiPriority="39" w:unhideWhenUsed="1"/>
+    <w:lsdException w:name="toc 7" w:semiHidden="1" w:uiPriority="39" w:unhideWhenUsed="1"/>
+    <w:lsdException w:name="toc 8" w:semiHidden="1" w:uiPriority="39" w:unhideWhenUsed="1"/>
+    <w:lsdException w:name="toc 9" w:semiHidden="1" w:uiPriority="39" w:unhideWhenUsed="1"/>
     <w:lsdException w:name="Normal Indent" w:semiHidden="1" w:unhideWhenUsed="1"/>
     <w:lsdException w:name="footnote text" w:semiHidden="1" w:unhideWhenUsed="1"/>
     <w:lsdException w:name="annotation text" w:semiHidden="1" w:unhideWhenUsed="1"/>
     <w:lsdException w:name="header" w:semiHidden="1" w:unhideWhenUsed="1"/>
     <w:lsdException w:name="footer" w:semiHidden="1" w:unhideWhenUsed="1"/>
     <w:lsdException w:name="index heading" w:semiHidden="1" w:unhideWhenUsed="1"/>
-    <w:lsdException w:name="caption" w:uiPriority="35" w:semiHidden="1" w:unhideWhenUsed="1" w:qFormat="1"/>
+    <w:lsdException w:name="caption" w:semiHidden="1" w:uiPriority="35" w:unhideWhenUsed="1" w:qFormat="1"/>
     <w:lsdException w:name="table of figures" w:semiHidden="1" w:unhideWhenUsed="1"/>
     <w:lsdException w:name="envelope address" w:semiHidden="1" w:unhideWhenUsed="1"/>
     <w:lsdException w:name="envelope return" w:semiHidden="1" w:unhideWhenUsed="1"/>
-    <w:lsdException w:name="footnote reference" w:uiPriority="0" w:semiHidden="1" w:unhideWhenUsed="1"/>
+    <w:lsdException w:name="footnote reference" w:semiHidden="1" w:uiPriority="0" w:unhideWhenUsed="1"/>
     <w:lsdException w:name="annotation reference" w:semiHidden="1" w:unhideWhenUsed="1"/>
     <w:lsdException w:name="line number" w:semiHidden="1" w:unhideWhenUsed="1"/>
     <w:lsdException w:name="page number" w:semiHidden="1" w:unhideWhenUsed="1"/>
@@ -1426,7 +1364,7 @@
     <w:lsdException w:name="Title" w:uiPriority="10" w:qFormat="1"/>
     <w:lsdException w:name="Closing" w:semiHidden="1" w:unhideWhenUsed="1"/>
     <w:lsdException w:name="Signature" w:semiHidden="1" w:unhideWhenUsed="1"/>
-    <w:lsdException w:name="Default Paragraph Font" w:uiPriority="1" w:semiHidden="1" w:unhideWhenUsed="1"/>
+    <w:lsdException w:name="Default Paragraph Font" w:semiHidden="1" w:uiPriority="1" w:unhideWhenUsed="1"/>
     <w:lsdException w:name="Body Text" w:semiHidden="1" w:unhideWhenUsed="1"/>
     <w:lsdException w:name="Body Text Indent" w:semiHidden="1" w:unhideWhenUsed="1"/>
     <w:lsdException w:name="List Continue" w:semiHidden="1" w:unhideWhenUsed="1"/>
@@ -1626,8 +1564,8 @@
     <w:lsdException w:name="Subtle Reference" w:uiPriority="31" w:qFormat="1"/>
     <w:lsdException w:name="Intense Reference" w:uiPriority="32" w:qFormat="1"/>
     <w:lsdException w:name="Book Title" w:uiPriority="33" w:qFormat="1"/>
-    <w:lsdException w:name="Bibliography" w:uiPriority="37" w:semiHidden="1" w:unhideWhenUsed="1"/>
-    <w:lsdException w:name="TOC Heading" w:uiPriority="39" w:semiHidden="1" w:unhideWhenUsed="1" w:qFormat="1"/>
+    <w:lsdException w:name="Bibliography" w:semiHidden="1" w:uiPriority="37" w:unhideWhenUsed="1"/>
+    <w:lsdException w:name="TOC Heading" w:semiHidden="1" w:uiPriority="39" w:unhideWhenUsed="1" w:qFormat="1"/>
     <w:lsdException w:name="Plain Table 1" w:uiPriority="41"/>
     <w:lsdException w:name="Plain Table 2" w:uiPriority="42"/>
     <w:lsdException w:name="Plain Table 3" w:uiPriority="43"/>
@@ -1738,7 +1676,7 @@
     <w:lsdException w:name="Unresolved Mention" w:semiHidden="1" w:unhideWhenUsed="1"/>
     <w:lsdException w:name="Smart Link" w:semiHidden="1" w:unhideWhenUsed="1"/>
   </w:latentStyles>
-  <w:style w:type="paragraph" w:styleId="Normal" w:default="1">
+  <w:style w:type="paragraph" w:default="1" w:styleId="Normal">
     <w:name w:val="Normal"/>
     <w:qFormat/>
   </w:style>
@@ -1854,12 +1792,13 @@
       <w:color w:val="666666"/>
     </w:rPr>
   </w:style>
-  <w:style w:type="character" w:styleId="DefaultParagraphFont" w:default="1">
+  <w:style w:type="character" w:default="1" w:styleId="DefaultParagraphFont">
     <w:name w:val="Default Paragraph Font"/>
     <w:uiPriority w:val="1"/>
-    <w:unhideWhenUsed/>
-  </w:style>
-  <w:style w:type="table" w:styleId="TableNormal" w:default="1">
+    <w:semiHidden/>
+    <w:unhideWhenUsed/>
+  </w:style>
+  <w:style w:type="table" w:default="1" w:styleId="TableNormal">
     <w:name w:val="Normal Table"/>
     <w:uiPriority w:val="99"/>
     <w:semiHidden/>
@@ -1874,7 +1813,7 @@
       </w:tblCellMar>
     </w:tblPr>
   </w:style>
-  <w:style w:type="numbering" w:styleId="NoList" w:default="1">
+  <w:style w:type="numbering" w:default="1" w:styleId="NoList">
     <w:name w:val="No List"/>
     <w:uiPriority w:val="99"/>
     <w:semiHidden/>
@@ -1930,7 +1869,7 @@
       <w:szCs w:val="20"/>
     </w:rPr>
   </w:style>
-  <w:style w:type="character" w:styleId="FootnoteTextChar" w:customStyle="1">
+  <w:style w:type="character" w:customStyle="1" w:styleId="FootnoteTextChar">
     <w:name w:val="Footnote Text Char"/>
     <w:basedOn w:val="DefaultParagraphFont"/>
     <w:link w:val="FootnoteText"/>
@@ -1951,7 +1890,7 @@
       <w:vertAlign w:val="superscript"/>
     </w:rPr>
   </w:style>
-  <w:style w:type="table" w:styleId="a" w:customStyle="1">
+  <w:style w:type="table" w:customStyle="1" w:styleId="a">
     <w:name w:val="a"/>
     <w:basedOn w:val="TableNormal"/>
     <w:rsid w:val="005B5FBD"/>
@@ -1969,7 +1908,7 @@
       </w:tblCellMar>
     </w:tblPr>
   </w:style>
-  <w:style w:type="table" w:styleId="a0" w:customStyle="1">
+  <w:style w:type="table" w:customStyle="1" w:styleId="a0">
     <w:name w:val="a0"/>
     <w:basedOn w:val="TableNormal"/>
     <w:rsid w:val="005B5FBD"/>
@@ -2004,7 +1943,7 @@
       <w:lang w:val="en"/>
     </w:rPr>
   </w:style>
-  <w:style w:type="character" w:styleId="CommentTextChar" w:customStyle="1">
+  <w:style w:type="character" w:customStyle="1" w:styleId="CommentTextChar">
     <w:name w:val="Comment Text Char"/>
     <w:basedOn w:val="DefaultParagraphFont"/>
     <w:link w:val="CommentText"/>
@@ -2047,7 +1986,7 @@
       <w:lang w:val="en"/>
     </w:rPr>
   </w:style>
-  <w:style w:type="character" w:styleId="BalloonTextChar" w:customStyle="1">
+  <w:style w:type="character" w:customStyle="1" w:styleId="BalloonTextChar">
     <w:name w:val="Balloon Text Char"/>
     <w:basedOn w:val="DefaultParagraphFont"/>
     <w:link w:val="BalloonText"/>
@@ -2115,7 +2054,7 @@
       <w:outlineLvl w:val="9"/>
     </w:pPr>
     <w:rPr>
-      <w:rFonts w:asciiTheme="majorHAnsi" w:hAnsiTheme="majorHAnsi" w:eastAsiaTheme="majorEastAsia" w:cstheme="majorBidi"/>
+      <w:rFonts w:asciiTheme="majorHAnsi" w:eastAsiaTheme="majorEastAsia" w:hAnsiTheme="majorHAnsi" w:cstheme="majorBidi"/>
       <w:b/>
       <w:bCs/>
       <w:color w:val="365F91" w:themeColor="accent1" w:themeShade="BF"/>
@@ -2318,7 +2257,7 @@
       <w:lang w:val="en"/>
     </w:rPr>
   </w:style>
-  <w:style w:type="character" w:styleId="QuoteChar" w:customStyle="1">
+  <w:style w:type="character" w:customStyle="1" w:styleId="QuoteChar">
     <w:name w:val="Quote Char"/>
     <w:basedOn w:val="DefaultParagraphFont"/>
     <w:link w:val="Quote"/>
@@ -2344,7 +2283,7 @@
       <w:lang w:val="en"/>
     </w:rPr>
   </w:style>
-  <w:style w:type="paragraph" w:styleId="H3" w:customStyle="1">
+  <w:style w:type="paragraph" w:customStyle="1" w:styleId="H3">
     <w:name w:val="H3"/>
     <w:basedOn w:val="Heading3"/>
     <w:qFormat/>
@@ -2373,7 +2312,7 @@
       <w:spacing w:val="5"/>
     </w:rPr>
   </w:style>
-  <w:style w:type="paragraph" w:styleId="Thirdlevel" w:customStyle="1">
+  <w:style w:type="paragraph" w:customStyle="1" w:styleId="Thirdlevel">
     <w:name w:val="Third level"/>
     <w:basedOn w:val="Heading3"/>
     <w:autoRedefine/>
@@ -2404,7 +2343,7 @@
       <w:bCs/>
     </w:rPr>
   </w:style>
-  <w:style w:type="character" w:styleId="CommentSubjectChar" w:customStyle="1">
+  <w:style w:type="character" w:customStyle="1" w:styleId="CommentSubjectChar">
     <w:name w:val="Comment Subject Char"/>
     <w:basedOn w:val="CommentTextChar"/>
     <w:link w:val="CommentSubject"/>
@@ -2437,7 +2376,7 @@
       <w:lang w:val="en"/>
     </w:rPr>
   </w:style>
-  <w:style w:type="character" w:styleId="HeaderChar" w:customStyle="1">
+  <w:style w:type="character" w:customStyle="1" w:styleId="HeaderChar">
     <w:name w:val="Header Char"/>
     <w:basedOn w:val="DefaultParagraphFont"/>
     <w:link w:val="Header"/>
@@ -2465,7 +2404,7 @@
       <w:lang w:val="en"/>
     </w:rPr>
   </w:style>
-  <w:style w:type="character" w:styleId="FooterChar" w:customStyle="1">
+  <w:style w:type="character" w:customStyle="1" w:styleId="FooterChar">
     <w:name w:val="Footer Char"/>
     <w:basedOn w:val="DefaultParagraphFont"/>
     <w:link w:val="Footer"/>
@@ -2485,13 +2424,13 @@
       <w:spacing w:before="100" w:beforeAutospacing="1" w:after="100" w:afterAutospacing="1" w:line="240" w:lineRule="auto"/>
     </w:pPr>
     <w:rPr>
-      <w:rFonts w:ascii="Times New Roman" w:hAnsi="Times New Roman" w:eastAsia="Times New Roman" w:cs="Times New Roman"/>
+      <w:rFonts w:ascii="Times New Roman" w:eastAsia="Times New Roman" w:hAnsi="Times New Roman" w:cs="Times New Roman"/>
       <w:sz w:val="24"/>
       <w:szCs w:val="24"/>
       <w:lang w:val="en-US"/>
     </w:rPr>
   </w:style>
-  <w:style w:type="paragraph" w:styleId="Ttulo2" w:customStyle="1">
+  <w:style w:type="paragraph" w:customStyle="1" w:styleId="Ttulo2">
     <w:name w:val="Título2"/>
     <w:basedOn w:val="Normal"/>
     <w:rsid w:val="00F232A7"/>
@@ -2505,14 +2444,14 @@
       <w:outlineLvl w:val="1"/>
     </w:pPr>
     <w:rPr>
-      <w:rFonts w:ascii="Times New Roman" w:hAnsi="Times New Roman" w:eastAsia="Times New Roman" w:cs="Times New Roman"/>
+      <w:rFonts w:ascii="Times New Roman" w:eastAsia="Times New Roman" w:hAnsi="Times New Roman" w:cs="Times New Roman"/>
       <w:kern w:val="3"/>
       <w:sz w:val="32"/>
       <w:szCs w:val="32"/>
       <w:lang w:val="en-US" w:eastAsia="pt-BR"/>
     </w:rPr>
   </w:style>
-  <w:style w:type="paragraph" w:styleId="Ttulo3" w:customStyle="1">
+  <w:style w:type="paragraph" w:customStyle="1" w:styleId="Ttulo3">
     <w:name w:val="Título3"/>
     <w:basedOn w:val="Normal"/>
     <w:rsid w:val="00F232A7"/>
@@ -2526,7 +2465,7 @@
       <w:outlineLvl w:val="2"/>
     </w:pPr>
     <w:rPr>
-      <w:rFonts w:ascii="Times New Roman" w:hAnsi="Times New Roman" w:eastAsia="Times New Roman" w:cs="Times New Roman"/>
+      <w:rFonts w:ascii="Times New Roman" w:eastAsia="Times New Roman" w:hAnsi="Times New Roman" w:cs="Times New Roman"/>
       <w:color w:val="434343"/>
       <w:kern w:val="3"/>
       <w:sz w:val="28"/>
@@ -2534,11 +2473,11 @@
       <w:lang w:val="en-US" w:eastAsia="pt-BR"/>
     </w:rPr>
   </w:style>
-  <w:style w:type="character" w:styleId="Fontepargpadro" w:customStyle="1">
+  <w:style w:type="character" w:customStyle="1" w:styleId="Fontepargpadro">
     <w:name w:val="Fonteparág.padrão"/>
     <w:rsid w:val="00F232A7"/>
   </w:style>
-  <w:style w:type="paragraph" w:styleId="Ttulo1" w:customStyle="1">
+  <w:style w:type="paragraph" w:customStyle="1" w:styleId="Ttulo1">
     <w:name w:val="Título1"/>
     <w:basedOn w:val="Normal"/>
     <w:rsid w:val="00F232A7"/>
@@ -2552,14 +2491,14 @@
       <w:outlineLvl w:val="0"/>
     </w:pPr>
     <w:rPr>
-      <w:rFonts w:ascii="Times New Roman" w:hAnsi="Times New Roman" w:eastAsia="Times New Roman" w:cs="Times New Roman"/>
+      <w:rFonts w:ascii="Times New Roman" w:eastAsia="Times New Roman" w:hAnsi="Times New Roman" w:cs="Times New Roman"/>
       <w:kern w:val="3"/>
       <w:sz w:val="40"/>
       <w:szCs w:val="40"/>
       <w:lang w:val="en-US" w:eastAsia="pt-BR"/>
     </w:rPr>
   </w:style>
-  <w:style w:type="character" w:styleId="Internetlink" w:customStyle="1">
+  <w:style w:type="character" w:customStyle="1" w:styleId="Internetlink">
     <w:name w:val="Internet link"/>
     <w:basedOn w:val="Fontepargpadro"/>
     <w:rsid w:val="00F232A7"/>
@@ -2568,7 +2507,7 @@
       <w:u w:val="single"/>
     </w:rPr>
   </w:style>
-  <w:style w:type="numbering" w:styleId="LS4" w:customStyle="1">
+  <w:style w:type="numbering" w:customStyle="1" w:styleId="LS4">
     <w:name w:val="LS4"/>
     <w:basedOn w:val="NoList"/>
     <w:rsid w:val="00F232A7"/>
@@ -2578,7 +2517,7 @@
       </w:numPr>
     </w:pPr>
   </w:style>
-  <w:style w:type="numbering" w:styleId="LS5" w:customStyle="1">
+  <w:style w:type="numbering" w:customStyle="1" w:styleId="LS5">
     <w:name w:val="LS5"/>
     <w:basedOn w:val="NoList"/>
     <w:rsid w:val="00F232A7"/>
@@ -2588,7 +2527,7 @@
       </w:numPr>
     </w:pPr>
   </w:style>
-  <w:style w:type="paragraph" w:styleId="Subttulo1" w:customStyle="1">
+  <w:style w:type="paragraph" w:customStyle="1" w:styleId="Subttulo1">
     <w:name w:val="Subtítulo1"/>
     <w:basedOn w:val="Normal"/>
     <w:link w:val="SubtitleChar"/>
@@ -2599,7 +2538,7 @@
       <w:jc w:val="both"/>
     </w:pPr>
     <w:rPr>
-      <w:rFonts w:ascii="Times New Roman" w:hAnsi="Times New Roman" w:eastAsia="Times New Roman" w:cs="Times New Roman"/>
+      <w:rFonts w:ascii="Times New Roman" w:eastAsia="Times New Roman" w:hAnsi="Times New Roman" w:cs="Times New Roman"/>
       <w:i/>
       <w:iCs/>
       <w:sz w:val="20"/>
@@ -2607,13 +2546,13 @@
       <w:lang w:val="en-US"/>
     </w:rPr>
   </w:style>
-  <w:style w:type="character" w:styleId="SubtitleChar" w:customStyle="1">
+  <w:style w:type="character" w:customStyle="1" w:styleId="SubtitleChar">
     <w:name w:val="Subtitle Char"/>
     <w:basedOn w:val="DefaultParagraphFont"/>
     <w:link w:val="Subttulo1"/>
     <w:rsid w:val="00F232A7"/>
     <w:rPr>
-      <w:rFonts w:ascii="Times New Roman" w:hAnsi="Times New Roman" w:eastAsia="Times New Roman" w:cs="Times New Roman"/>
+      <w:rFonts w:ascii="Times New Roman" w:eastAsia="Times New Roman" w:hAnsi="Times New Roman" w:cs="Times New Roman"/>
       <w:i/>
       <w:iCs/>
       <w:sz w:val="20"/>
@@ -2633,13 +2572,13 @@
       <w:spacing w:line="240" w:lineRule="auto"/>
     </w:pPr>
     <w:rPr>
-      <w:rFonts w:ascii="Times New Roman" w:hAnsi="Times New Roman" w:eastAsia="Times New Roman" w:cs="Times New Roman"/>
+      <w:rFonts w:ascii="Times New Roman" w:eastAsia="Times New Roman" w:hAnsi="Times New Roman" w:cs="Times New Roman"/>
       <w:sz w:val="20"/>
       <w:szCs w:val="20"/>
       <w:lang w:val="en-US"/>
     </w:rPr>
   </w:style>
-  <w:style w:type="character" w:styleId="EndnoteTextChar" w:customStyle="1">
+  <w:style w:type="character" w:customStyle="1" w:styleId="EndnoteTextChar">
     <w:name w:val="Endnote Text Char"/>
     <w:basedOn w:val="DefaultParagraphFont"/>
     <w:link w:val="EndnoteText"/>
@@ -2647,7 +2586,7 @@
     <w:semiHidden/>
     <w:rsid w:val="003E2789"/>
     <w:rPr>
-      <w:rFonts w:ascii="Times New Roman" w:hAnsi="Times New Roman" w:eastAsia="Times New Roman" w:cs="Times New Roman"/>
+      <w:rFonts w:ascii="Times New Roman" w:eastAsia="Times New Roman" w:hAnsi="Times New Roman" w:cs="Times New Roman"/>
       <w:sz w:val="20"/>
       <w:szCs w:val="20"/>
       <w:lang w:val="en-US"/>
@@ -2676,7 +2615,7 @@
       <w:ind w:left="720" w:hanging="720"/>
     </w:pPr>
   </w:style>
-  <w:style w:type="character" w:styleId="tlid-translation" w:customStyle="1">
+  <w:style w:type="character" w:customStyle="1" w:styleId="tlid-translation">
     <w:name w:val="tlid-translation"/>
     <w:basedOn w:val="DefaultParagraphFont"/>
     <w:rsid w:val="0074028B"/>
@@ -2700,12 +2639,12 @@
     <w:unhideWhenUsed/>
     <w:rsid w:val="00B2252B"/>
   </w:style>
-  <w:style w:type="character" w:styleId="sc-kafwex" w:customStyle="1">
+  <w:style w:type="character" w:customStyle="1" w:styleId="sc-kafwex">
     <w:name w:val="sc-kafwex"/>
     <w:basedOn w:val="DefaultParagraphFont"/>
     <w:rsid w:val="00630AF7"/>
   </w:style>
-  <w:style w:type="character" w:styleId="TitleChar" w:customStyle="1">
+  <w:style w:type="character" w:customStyle="1" w:styleId="TitleChar">
     <w:name w:val="Title Char"/>
     <w:basedOn w:val="DefaultParagraphFont"/>
     <w:link w:val="Title"/>
@@ -2725,7 +2664,7 @@
     <w:unhideWhenUsed/>
     <w:rsid w:val="00304D82"/>
   </w:style>
-  <w:style w:type="paragraph" w:styleId="Default" w:customStyle="1">
+  <w:style w:type="paragraph" w:customStyle="1" w:styleId="Default">
     <w:name w:val="Default"/>
     <w:rsid w:val="006074F7"/>
     <w:pPr>
@@ -2735,7 +2674,7 @@
       <w:spacing w:line="240" w:lineRule="auto"/>
     </w:pPr>
     <w:rPr>
-      <w:rFonts w:ascii="Times New Roman" w:hAnsi="Times New Roman" w:eastAsia="Times New Roman" w:cs="Times New Roman"/>
+      <w:rFonts w:ascii="Times New Roman" w:eastAsia="Times New Roman" w:hAnsi="Times New Roman" w:cs="Times New Roman"/>
       <w:color w:val="000000"/>
       <w:sz w:val="24"/>
       <w:szCs w:val="24"/>
@@ -2783,13 +2722,13 @@
       <w:spacing w:line="240" w:lineRule="auto"/>
     </w:pPr>
     <w:rPr>
-      <w:rFonts w:ascii="Courier New" w:hAnsi="Courier New" w:eastAsia="Times New Roman" w:cs="Courier New"/>
+      <w:rFonts w:ascii="Courier New" w:eastAsia="Times New Roman" w:hAnsi="Courier New" w:cs="Courier New"/>
       <w:sz w:val="20"/>
       <w:szCs w:val="20"/>
       <w:lang w:val="en-US"/>
     </w:rPr>
   </w:style>
-  <w:style w:type="character" w:styleId="HTMLPreformattedChar" w:customStyle="1">
+  <w:style w:type="character" w:customStyle="1" w:styleId="HTMLPreformattedChar">
     <w:name w:val="HTML Preformatted Char"/>
     <w:basedOn w:val="DefaultParagraphFont"/>
     <w:link w:val="HTMLPreformatted"/>
@@ -2797,7 +2736,7 @@
     <w:semiHidden/>
     <w:rsid w:val="00DE276D"/>
     <w:rPr>
-      <w:rFonts w:ascii="Courier New" w:hAnsi="Courier New" w:eastAsia="Times New Roman" w:cs="Courier New"/>
+      <w:rFonts w:ascii="Courier New" w:eastAsia="Times New Roman" w:hAnsi="Courier New" w:cs="Courier New"/>
       <w:sz w:val="20"/>
       <w:szCs w:val="20"/>
       <w:lang w:val="en-US"/>
@@ -2810,12 +2749,12 @@
     <w:unhideWhenUsed/>
     <w:rsid w:val="00DE276D"/>
     <w:rPr>
-      <w:rFonts w:ascii="Courier New" w:hAnsi="Courier New" w:eastAsia="Times New Roman" w:cs="Courier New"/>
+      <w:rFonts w:ascii="Courier New" w:eastAsia="Times New Roman" w:hAnsi="Courier New" w:cs="Courier New"/>
       <w:sz w:val="20"/>
       <w:szCs w:val="20"/>
     </w:rPr>
   </w:style>
-  <w:style w:type="character" w:styleId="Heading2Char" w:customStyle="1">
+  <w:style w:type="character" w:customStyle="1" w:styleId="Heading2Char">
     <w:name w:val="Heading 2 Char"/>
     <w:basedOn w:val="DefaultParagraphFont"/>
     <w:link w:val="Heading2"/>
@@ -2826,7 +2765,7 @@
       <w:szCs w:val="32"/>
     </w:rPr>
   </w:style>
-  <w:style w:type="character" w:styleId="Heading1Char" w:customStyle="1">
+  <w:style w:type="character" w:customStyle="1" w:styleId="Heading1Char">
     <w:name w:val="Heading 1 Char"/>
     <w:basedOn w:val="DefaultParagraphFont"/>
     <w:link w:val="Heading1"/>

</xml_diff>